<commit_message>
docs(graduation): add LLM agent/tool-calling & meeting-understanding sections to lit review, regenerate docs, add AIGC detection reports
</commit_message>
<xml_diff>
--- a/毕业设计材料/开题报告-基于树莓派的Agent智能镜子助手.docx
+++ b/毕业设计材料/开题报告-基于树莓派的Agent智能镜子助手.docx
@@ -860,6 +860,76 @@
         <w:t>[12] 宗成庆. 统计自然语言处理（第2版）[M]. 北京: 清华大学出版社, 2013.</w:t>
       </w:r>
     </w:p>
+    <w:p>
+      <w:pPr>
+        <w:spacing w:line="360" w:lineRule="auto" w:before="0" w:after="60"/>
+      </w:pPr>
+      <w:r>
+        <w:rPr>
+          <w:rFonts w:ascii="Times New Roman" w:hAnsi="Times New Roman" w:eastAsia="宋体"/>
+          <w:b w:val="0"/>
+          <w:color w:val="000000"/>
+          <w:sz w:val="21"/>
+        </w:rPr>
+        <w:t>[13] Yao S, Zhao J, Yu D, et al. ReAct: Synergizing reasoning and acting in language models[C]//Proceedings of the 11th International Conference on Learning Representations (ICLR). 2023.</w:t>
+      </w:r>
+    </w:p>
+    <w:p>
+      <w:pPr>
+        <w:spacing w:line="360" w:lineRule="auto" w:before="0" w:after="60"/>
+      </w:pPr>
+      <w:r>
+        <w:rPr>
+          <w:rFonts w:ascii="Times New Roman" w:hAnsi="Times New Roman" w:eastAsia="宋体"/>
+          <w:b w:val="0"/>
+          <w:color w:val="000000"/>
+          <w:sz w:val="21"/>
+        </w:rPr>
+        <w:t>[14] Schick T, Dwivedi-Yu J, Dessì R, et al. Toolformer: Language models can teach themselves to use tools[C]//Advances in Neural Information Processing Systems (NeurIPS). 2023.</w:t>
+      </w:r>
+    </w:p>
+    <w:p>
+      <w:pPr>
+        <w:spacing w:line="360" w:lineRule="auto" w:before="0" w:after="60"/>
+      </w:pPr>
+      <w:r>
+        <w:rPr>
+          <w:rFonts w:ascii="Times New Roman" w:hAnsi="Times New Roman" w:eastAsia="宋体"/>
+          <w:b w:val="0"/>
+          <w:color w:val="000000"/>
+          <w:sz w:val="21"/>
+        </w:rPr>
+        <w:t>[15] Xi Z, Chen W, Guo X, et al. The rise and potential of large language model based agents: A survey[EB/OL]. arXiv preprint arXiv:2309.07864, 2023.</w:t>
+      </w:r>
+    </w:p>
+    <w:p>
+      <w:pPr>
+        <w:spacing w:line="360" w:lineRule="auto" w:before="0" w:after="60"/>
+      </w:pPr>
+      <w:r>
+        <w:rPr>
+          <w:rFonts w:ascii="Times New Roman" w:hAnsi="Times New Roman" w:eastAsia="宋体"/>
+          <w:b w:val="0"/>
+          <w:color w:val="000000"/>
+          <w:sz w:val="21"/>
+        </w:rPr>
+        <w:t>[16] Carletta J, Ashby S, Bourban S, et al. The AMI meeting corpus: A pre-announcement[C]//International Workshop on Machine Learning for Multimodal Interaction (MLMI). 2005: 28-39.</w:t>
+      </w:r>
+    </w:p>
+    <w:p>
+      <w:pPr>
+        <w:spacing w:line="360" w:lineRule="auto" w:before="0" w:after="60"/>
+      </w:pPr>
+      <w:r>
+        <w:rPr>
+          <w:rFonts w:ascii="Times New Roman" w:hAnsi="Times New Roman" w:eastAsia="宋体"/>
+          <w:b w:val="0"/>
+          <w:color w:val="000000"/>
+          <w:sz w:val="21"/>
+        </w:rPr>
+        <w:t>[17] Zhong M, Yin D, Yu T, et al. QMSum: A query-based multi-domain meeting summarization dataset[C]//Proceedings of the 2021 Conference of the North American Chapter of the Association for Computational Linguistics (NAACL). 2021: 5590-5600.</w:t>
+      </w:r>
+    </w:p>
     <w:p/>
     <w:p>
       <w:pPr>

</xml_diff>